<commit_message>
Nombres de los integrantes y referencias a la presentacion
- Portada de la documentacion con Mariana Aguilar Alcaraz y Giany Andres Salazar Bustamante.
- La documentacion y el README apuntan a presentacion/Exposicion_Taller3.pptx (23 diapositivas).
- requirements.txt: python-docx en lugar de python-pptx.
</commit_message>
<xml_diff>
--- a/docs/Documentacion_Taller3.docx
+++ b/docs/Documentacion_Taller3.docx
@@ -82,7 +82,7 @@
           <w:b w:val="0"/>
           <w:i w:val="0"/>
         </w:rPr>
-        <w:t>[Nombre del integrante 1] y [Nombre del integrante 2]</w:t>
+        <w:t>Mariana Aguilar Alcaraz y Giany Andrés Salazar Bustamante</w:t>
       </w:r>
     </w:p>
     <w:p>
@@ -865,7 +865,7 @@
                 <w:i w:val="0"/>
                 <w:sz w:val="20"/>
               </w:rPr>
-              <w:t>presentacion/Sustentacion_Taller3.pptx</w:t>
+              <w:t>presentacion/Exposicion_Taller3.pptx</w:t>
             </w:r>
           </w:p>
         </w:tc>
@@ -8117,30 +8117,14 @@
           <w:i w:val="0"/>
           <w:sz w:val="22"/>
         </w:rPr>
-        <w:t>presentacion/Sustentacion_Taller3.pptx</w:t>
+        <w:t>presentacion/Exposicion_Taller3.pptx</w:t>
       </w:r>
       <w:r>
         <w:rPr>
           <w:b w:val="0"/>
           <w:i w:val="0"/>
         </w:rPr>
-        <w:t xml:space="preserve"> y se genera con </w:t>
-      </w:r>
-      <w:r>
-        <w:rPr>
-          <w:rFonts w:ascii="Courier New" w:hAnsi="Courier New"/>
-          <w:b w:val="0"/>
-          <w:i w:val="0"/>
-          <w:sz w:val="22"/>
-        </w:rPr>
-        <w:t>presentacion/generar_presentacion.py</w:t>
-      </w:r>
-      <w:r>
-        <w:rPr>
-          <w:b w:val="0"/>
-          <w:i w:val="0"/>
-        </w:rPr>
-        <w:t>. Tiene 22 diapositivas con notas para el expositor y sigue este recorrido: caso de estudio, modelo relacional, proceso de migración, modelo documental, decisiones de Embedding y Referencing, verificación, una diapositiva por cada consulta con su gráfico, hallazgo y decisión, la aplicación de escritorio y las conclusiones.</w:t>
+        <w:t xml:space="preserve"> y tiene 23 diapositivas. Mariana Aguilar Alcaraz expone las secciones 1 a 4 y las consultas C1 a C3, y Giany Andrés Salazar Bustamante expone las secciones 5 a 7 y las consultas C4 a C7. El recorrido es el siguiente: el caso de TiendaOnline, el modelo relacional y su volumen de registros, el paso de 10 tablas a 6 colecciones, las decisiones de Embedding y de Referencing, el código de la migración, la aplicación de escritorio y sus opciones de modelado, la verificación con 79 de 79 controles correctos, el documento de un pedido en MongoDB, una diapositiva por cada una de las siete consultas y las conclusiones.</w:t>
       </w:r>
     </w:p>
     <w:p>

</xml_diff>